<commit_message>
fix: onboarding CV AI parse and refresh signup pipeline docs
Disable Nemotron thinking for fast skills so onboarding-cv-parse returns
valid JSON; add AI-only regex flag, parse timeouts, and timing logs. Sync
pagesflow signup/onboarding DOCX, diagrams, and PAGE.md end-to-end.

Co-authored-by: Cursor <cursoragent@cursor.com>
</commit_message>
<xml_diff>
--- a/pagesflow/signup-onboarding/signup-onboarding-pipeline.docx
+++ b/pagesflow/signup-onboarding/signup-onboarding-pipeline.docx
@@ -13,7 +13,7 @@
     </w:p>
     <w:p>
       <w:r>
-        <w:t>End-to-end documentation for deferred email signup (/signup) and three-step onboarding (/onboarding) through first dashboard visit (/dashboard?welcome=1). Covers the Google shortcut entry path, all validation rules, HTTP errors, sessionStorage handoff, email OTP verification, account registration on finish, CV AI parse, and job delivery polling/SSE.</w:t>
+        <w:t>End-to-end documentation for deferred email signup (/signup) and three-step onboarding (/onboarding) through first dashboard visit (/dashboard?welcome=1). Covers the Google shortcut entry path, all validation rules, HTTP errors, sessionStorage handoff, email OTP verification, account registration on finish (with org provisioning), CV AI parse (Nemotron fast tier, enable_thinking=false), cvMarkdown lifecycle, regex/AI-only modes, and job delivery polling/SSE. Updated June 2026.</w:t>
       </w:r>
     </w:p>
     <w:p>
@@ -39,7 +39,7 @@
       <w:r>
         <w:drawing>
           <wp:inline xmlns:a="http://schemas.openxmlformats.org/drawingml/2006/main" xmlns:pic="http://schemas.openxmlformats.org/drawingml/2006/picture">
-            <wp:extent cx="5943600" cy="6847643"/>
+            <wp:extent cx="5943600" cy="7352199"/>
             <wp:docPr id="1" name="Picture 1"/>
             <wp:cNvGraphicFramePr>
               <a:graphicFrameLocks noChangeAspect="1"/>
@@ -60,7 +60,7 @@
                   <pic:spPr>
                     <a:xfrm>
                       <a:off x="0" y="0"/>
-                      <a:ext cx="5943600" cy="6847643"/>
+                      <a:ext cx="5943600" cy="7352199"/>
                     </a:xfrm>
                     <a:prstGeom prst="rect"/>
                   </pic:spPr>
@@ -584,7 +584,111 @@
           </w:tcPr>
           <w:p>
             <w:r>
-              <w:t>Regex parse + warning toast</w:t>
+              <w:t>Regex parse + warning toast (when regex enabled)</w:t>
+            </w:r>
+          </w:p>
+        </w:tc>
+      </w:tr>
+      <w:tr>
+        <w:tc>
+          <w:tcPr>
+            <w:tcW w:type="dxa" w:w="1728"/>
+          </w:tcPr>
+          <w:p>
+            <w:r>
+              <w:t>CV parse AI-only mode</w:t>
+            </w:r>
+          </w:p>
+        </w:tc>
+        <w:tc>
+          <w:tcPr>
+            <w:tcW w:type="dxa" w:w="1728"/>
+          </w:tcPr>
+          <w:p>
+            <w:r>
+              <w:t>step 0</w:t>
+            </w:r>
+          </w:p>
+        </w:tc>
+        <w:tc>
+          <w:tcPr>
+            <w:tcW w:type="dxa" w:w="1728"/>
+          </w:tcPr>
+          <w:p>
+            <w:r>
+              <w:t>—</w:t>
+            </w:r>
+          </w:p>
+        </w:tc>
+        <w:tc>
+          <w:tcPr>
+            <w:tcW w:type="dxa" w:w="1728"/>
+          </w:tcPr>
+          <w:p>
+            <w:r>
+              <w:t>—</w:t>
+            </w:r>
+          </w:p>
+        </w:tc>
+        <w:tc>
+          <w:tcPr>
+            <w:tcW w:type="dxa" w:w="1728"/>
+          </w:tcPr>
+          <w:p>
+            <w:r>
+              <w:t>ONBOARDING_CV_REGEX_ENABLED=false → 422 on AI failure, no fallback</w:t>
+            </w:r>
+          </w:p>
+        </w:tc>
+      </w:tr>
+      <w:tr>
+        <w:tc>
+          <w:tcPr>
+            <w:tcW w:type="dxa" w:w="1728"/>
+          </w:tcPr>
+          <w:p>
+            <w:r>
+              <w:t>Plan limit at delivery</w:t>
+            </w:r>
+          </w:p>
+        </w:tc>
+        <w:tc>
+          <w:tcPr>
+            <w:tcW w:type="dxa" w:w="1728"/>
+          </w:tcPr>
+          <w:p>
+            <w:r>
+              <w:t>finish</w:t>
+            </w:r>
+          </w:p>
+        </w:tc>
+        <w:tc>
+          <w:tcPr>
+            <w:tcW w:type="dxa" w:w="1728"/>
+          </w:tcPr>
+          <w:p>
+            <w:r>
+              <w:t>—</w:t>
+            </w:r>
+          </w:p>
+        </w:tc>
+        <w:tc>
+          <w:tcPr>
+            <w:tcW w:type="dxa" w:w="1728"/>
+          </w:tcPr>
+          <w:p>
+            <w:r>
+              <w:t>Profile saved</w:t>
+            </w:r>
+          </w:p>
+        </w:tc>
+        <w:tc>
+          <w:tcPr>
+            <w:tcW w:type="dxa" w:w="1728"/>
+          </w:tcPr>
+          <w:p>
+            <w:r>
+              <w:t>402 toast + navigate /account/billing</w:t>
             </w:r>
           </w:p>
         </w:tc>
@@ -619,7 +723,7 @@
       <w:r>
         <w:drawing>
           <wp:inline xmlns:a="http://schemas.openxmlformats.org/drawingml/2006/main" xmlns:pic="http://schemas.openxmlformats.org/drawingml/2006/picture">
-            <wp:extent cx="5943600" cy="2246028"/>
+            <wp:extent cx="5943600" cy="2731308"/>
             <wp:docPr id="2" name="Picture 2"/>
             <wp:cNvGraphicFramePr>
               <a:graphicFrameLocks noChangeAspect="1"/>
@@ -640,7 +744,7 @@
                   <pic:spPr>
                     <a:xfrm>
                       <a:off x="0" y="0"/>
-                      <a:ext cx="5943600" cy="2246028"/>
+                      <a:ext cx="5943600" cy="2731308"/>
                     </a:xfrm>
                     <a:prstGeom prst="rect"/>
                   </pic:spPr>
@@ -3079,7 +3183,7 @@
         <w:pStyle w:val="ListBullet"/>
       </w:pPr>
       <w:r>
-        <w:t>Plan limit 402 on delivery shows upgrade toast; intended redirect to /account/billing.</w:t>
+        <w:t>Plan limit 402 on CV upload or delivery start: completeOnboardingFinish returns plan_limit reason; Onboarding.tsx navigates to /account/billing.</w:t>
       </w:r>
     </w:p>
     <w:p>
@@ -3087,7 +3191,7 @@
         <w:pStyle w:val="ListBullet"/>
       </w:pPr>
       <w:r>
-        <w:t>Known gap: Onboarding.tsx L402 calls navigate() but hook is nav — billing redirect may not fire.</w:t>
+        <w:t>Register provisions personal workspace + free subscription via OrgProvisioningService (replaces legacy trial schedulers).</w:t>
       </w:r>
     </w:p>
     <w:p>
@@ -3833,7 +3937,7 @@
         <w:pStyle w:val="ListBullet"/>
       </w:pPr>
       <w:r>
-        <w:t>POST /auth/onboarding/parse-cv — multipart file, signupIntentId, email, captchaToken.</w:t>
+        <w:t>POST /auth/onboarding/parse-cv — multipart file, signupIntentId, email, captchaToken. Frontend timeout 180s.</w:t>
       </w:r>
     </w:p>
     <w:p>
@@ -3841,7 +3945,7 @@
         <w:pStyle w:val="ListBullet"/>
       </w:pPr>
       <w:r>
-        <w:t>AI path when consent + onboarding.cv.ai-parse.enabled + NVIDIA configured; else regex.</w:t>
+        <w:t>Server: magic-byte validation (PDF/DOCX), max 5 MB, text extraction via CvParserService.</w:t>
       </w:r>
     </w:p>
     <w:p>
@@ -3849,7 +3953,7 @@
         <w:pStyle w:val="ListBullet"/>
       </w:pPr>
       <w:r>
-        <w:t>AI failure → regex fallback with parseWarnings toast.</w:t>
+        <w:t>AI path when signupIntent + aiProcessingAccepted + onboarding.cv.ai-parse.enabled + NVIDIA configured.</w:t>
       </w:r>
     </w:p>
     <w:p>
@@ -3857,9 +3961,231 @@
         <w:pStyle w:val="ListBullet"/>
       </w:pPr>
       <w:r>
-        <w:t>writeOnboardingCvDraft (cvMarkdown truncated 32KB client-side).</w:t>
+        <w:t>AI: OnboardingCvAiParseService → NvidiaService feature onboarding-cv-parse; fast model (default nvidia/nemotron-3-nano-30b-a3b); enable_thinking=false (NvidiaRequestSupport) so JSON is not truncated by reasoning tokens.</w:t>
       </w:r>
     </w:p>
+    <w:p>
+      <w:pPr>
+        <w:pStyle w:val="ListBullet"/>
+      </w:pPr>
+      <w:r>
+        <w:t>AI input: SYSTEM_PROMPT JSON schema + user CV TEXT (max 14,000 chars). Output includes cvMarkdown as a string field in JSON — not a disk file.</w:t>
+      </w:r>
+    </w:p>
+    <w:p>
+      <w:pPr>
+        <w:pStyle w:val="ListBullet"/>
+      </w:pPr>
+      <w:r>
+        <w:t>AI timeout: onboarding.cv.ai-parse.timeout.ms (default 60s). On timeout/failure: regex fallback when onboarding.cv.regex.enabled=true; else 422 (AI-only mode).</w:t>
+      </w:r>
+    </w:p>
+    <w:p>
+      <w:pPr>
+        <w:pStyle w:val="ListBullet"/>
+      </w:pPr>
+      <w:r>
+        <w:t>Regex path (default): section parsers + buildMarkdown(); merge strategy: AI primary, regex fills empty sections.</w:t>
+      </w:r>
+    </w:p>
+    <w:p>
+      <w:pPr>
+        <w:pStyle w:val="ListBullet"/>
+      </w:pPr>
+      <w:r>
+        <w:t>writeOnboardingCvDraft → careerops_onboarding_cv_draft in sessionStorage (cvMarkdown truncated 32KB). No .md file written at step 0.</w:t>
+      </w:r>
+    </w:p>
+    <w:p>
+      <w:pPr>
+        <w:pStyle w:val="Heading2"/>
+      </w:pPr>
+      <w:r>
+        <w:t>9.1.1 cvMarkdown lifecycle</w:t>
+      </w:r>
+    </w:p>
+    <w:tbl>
+      <w:tblPr>
+        <w:tblStyle w:val="TableGrid"/>
+        <w:tblW w:type="auto" w:w="0"/>
+        <w:tblLook w:firstColumn="1" w:firstRow="1" w:lastColumn="0" w:lastRow="0" w:noHBand="0" w:noVBand="1" w:val="04A0"/>
+      </w:tblPr>
+      <w:tblGrid>
+        <w:gridCol w:w="2880"/>
+        <w:gridCol w:w="2880"/>
+        <w:gridCol w:w="2880"/>
+      </w:tblGrid>
+      <w:tr>
+        <w:tc>
+          <w:tcPr>
+            <w:tcW w:type="dxa" w:w="2880"/>
+          </w:tcPr>
+          <w:p>
+            <w:r>
+              <w:rPr>
+                <w:b/>
+              </w:rPr>
+              <w:t>Stage</w:t>
+            </w:r>
+          </w:p>
+        </w:tc>
+        <w:tc>
+          <w:tcPr>
+            <w:tcW w:type="dxa" w:w="2880"/>
+          </w:tcPr>
+          <w:p>
+            <w:r>
+              <w:rPr>
+                <w:b/>
+              </w:rPr>
+              <w:t>Where cvMarkdown lives</w:t>
+            </w:r>
+          </w:p>
+        </w:tc>
+        <w:tc>
+          <w:tcPr>
+            <w:tcW w:type="dxa" w:w="2880"/>
+          </w:tcPr>
+          <w:p>
+            <w:r>
+              <w:rPr>
+                <w:b/>
+              </w:rPr>
+              <w:t>Notes</w:t>
+            </w:r>
+          </w:p>
+        </w:tc>
+      </w:tr>
+      <w:tr>
+        <w:tc>
+          <w:tcPr>
+            <w:tcW w:type="dxa" w:w="2880"/>
+          </w:tcPr>
+          <w:p>
+            <w:r>
+              <w:t>Step 0 parse-cv</w:t>
+            </w:r>
+          </w:p>
+        </w:tc>
+        <w:tc>
+          <w:tcPr>
+            <w:tcW w:type="dxa" w:w="2880"/>
+          </w:tcPr>
+          <w:p>
+            <w:r>
+              <w:t>API response string + sessionStorage draft</w:t>
+            </w:r>
+          </w:p>
+        </w:tc>
+        <w:tc>
+          <w:tcPr>
+            <w:tcW w:type="dxa" w:w="2880"/>
+          </w:tcPr>
+          <w:p>
+            <w:r>
+              <w:t>In-memory only; aids multi-step prefill metadata</w:t>
+            </w:r>
+          </w:p>
+        </w:tc>
+      </w:tr>
+      <w:tr>
+        <w:tc>
+          <w:tcPr>
+            <w:tcW w:type="dxa" w:w="2880"/>
+          </w:tcPr>
+          <w:p>
+            <w:r>
+              <w:t>Steps 1–2</w:t>
+            </w:r>
+          </w:p>
+        </w:tc>
+        <w:tc>
+          <w:tcPr>
+            <w:tcW w:type="dxa" w:w="2880"/>
+          </w:tcPr>
+          <w:p>
+            <w:r>
+              <w:t>sessionStorage careerops_onboarding_cv_draft</w:t>
+            </w:r>
+          </w:p>
+        </w:tc>
+        <w:tc>
+          <w:tcPr>
+            <w:tcW w:type="dxa" w:w="2880"/>
+          </w:tcPr>
+          <w:p>
+            <w:r>
+              <w:t>User form edits are authoritative; draft may lag</w:t>
+            </w:r>
+          </w:p>
+        </w:tc>
+      </w:tr>
+      <w:tr>
+        <w:tc>
+          <w:tcPr>
+            <w:tcW w:type="dxa" w:w="2880"/>
+          </w:tcPr>
+          <w:p>
+            <w:r>
+              <w:t>Finish upload</w:t>
+            </w:r>
+          </w:p>
+        </w:tc>
+        <w:tc>
+          <w:tcPr>
+            <w:tcW w:type="dxa" w:w="2880"/>
+          </w:tcPr>
+          <w:p>
+            <w:r>
+              <w:t>Original PDF/DOCX via POST /profile/cv</w:t>
+            </w:r>
+          </w:p>
+        </w:tc>
+        <w:tc>
+          <w:tcPr>
+            <w:tcW w:type="dxa" w:w="2880"/>
+          </w:tcPr>
+          <w:p>
+            <w:r>
+              <w:t>Not the markdown draft</w:t>
+            </w:r>
+          </w:p>
+        </w:tc>
+      </w:tr>
+      <w:tr>
+        <w:tc>
+          <w:tcPr>
+            <w:tcW w:type="dxa" w:w="2880"/>
+          </w:tcPr>
+          <w:p>
+            <w:r>
+              <w:t>Delivery normalizing_cv</w:t>
+            </w:r>
+          </w:p>
+        </w:tc>
+        <w:tc>
+          <w:tcPr>
+            <w:tcW w:type="dxa" w:w="2880"/>
+          </w:tcPr>
+          <w:p>
+            <w:r>
+              <w:t>user_cv.cv_markdown DB column</w:t>
+            </w:r>
+          </w:p>
+        </w:tc>
+        <w:tc>
+          <w:tcPr>
+            <w:tcW w:type="dxa" w:w="2880"/>
+          </w:tcPr>
+          <w:p>
+            <w:r>
+              <w:t>CvNormalizationService.normalizeAndStore after register</w:t>
+            </w:r>
+          </w:p>
+        </w:tc>
+      </w:tr>
+    </w:tbl>
+    <w:p/>
     <w:p>
       <w:pPr>
         <w:pStyle w:val="Heading2"/>
@@ -3875,7 +4201,7 @@
       <w:r>
         <w:drawing>
           <wp:inline xmlns:a="http://schemas.openxmlformats.org/drawingml/2006/main" xmlns:pic="http://schemas.openxmlformats.org/drawingml/2006/picture">
-            <wp:extent cx="5943600" cy="7979973"/>
+            <wp:extent cx="5943600" cy="6141147"/>
             <wp:docPr id="10" name="Picture 10"/>
             <wp:cNvGraphicFramePr>
               <a:graphicFrameLocks noChangeAspect="1"/>
@@ -3896,7 +4222,7 @@
                   <pic:spPr>
                     <a:xfrm>
                       <a:off x="0" y="0"/>
-                      <a:ext cx="5943600" cy="7979973"/>
+                      <a:ext cx="5943600" cy="6141147"/>
                     </a:xfrm>
                     <a:prstGeom prst="rect"/>
                   </pic:spPr>
@@ -4137,7 +4463,7 @@
         <w:pStyle w:val="ListBullet"/>
       </w:pPr>
       <w:r>
-        <w:t>2. PUT /profile onboarded:true — Saving your profile…</w:t>
+        <w:t xml:space="preserve">   Register: atomic signup-intent consume, email verification consume, reCAPTCHA when configured, OrgProvisioningService.provisionForNewUser (workspace + free subscription + primaryBillingOrganizationId).</w:t>
       </w:r>
     </w:p>
     <w:p>
@@ -4145,7 +4471,7 @@
         <w:pStyle w:val="ListBullet"/>
       </w:pPr>
       <w:r>
-        <w:t>3. POST /profile/cv + POST /profile/portfolio per project</w:t>
+        <w:t>2. PUT /profile onboarded:true — Saving your profile… (work/education JSONB, preferences)</w:t>
       </w:r>
     </w:p>
     <w:p>
@@ -4153,7 +4479,15 @@
         <w:pStyle w:val="ListBullet"/>
       </w:pPr>
       <w:r>
-        <w:t>4. POST /onboarding/delivery/start — Starting job search…</w:t>
+        <w:t>3. POST /profile/cv (original file) + POST /profile/portfolio per project row</w:t>
+      </w:r>
+    </w:p>
+    <w:p>
+      <w:pPr>
+        <w:pStyle w:val="ListBullet"/>
+      </w:pPr>
+      <w:r>
+        <w:t>4. POST /onboarding/delivery/start (@PlanGated ai_skill_run) — Starting job search…</w:t>
       </w:r>
     </w:p>
     <w:p>
@@ -4179,7 +4513,7 @@
       <w:r>
         <w:drawing>
           <wp:inline xmlns:a="http://schemas.openxmlformats.org/drawingml/2006/main" xmlns:pic="http://schemas.openxmlformats.org/drawingml/2006/picture">
-            <wp:extent cx="5943600" cy="5111688"/>
+            <wp:extent cx="5943600" cy="5226417"/>
             <wp:docPr id="14" name="Picture 14"/>
             <wp:cNvGraphicFramePr>
               <a:graphicFrameLocks noChangeAspect="1"/>
@@ -4200,7 +4534,7 @@
                   <pic:spPr>
                     <a:xfrm>
                       <a:off x="0" y="0"/>
-                      <a:ext cx="5943600" cy="5111688"/>
+                      <a:ext cx="5943600" cy="5226417"/>
                     </a:xfrm>
                     <a:prstGeom prst="rect"/>
                   </pic:spPr>
@@ -4225,7 +4559,15 @@
         <w:pStyle w:val="ListBullet"/>
       </w:pPr>
       <w:r>
-        <w:t>Stages: reading_cv → normalizing_cv → fetching_jobs → evaluating_jobs → ready | ready_partial | failed.</w:t>
+        <w:t>Stages: reading_cv → normalizing_cv (CvNormalizationService → user_cv.cv_markdown) → fetching_jobs → evaluating_jobs → ready | ready_partial | failed.</w:t>
+      </w:r>
+    </w:p>
+    <w:p>
+      <w:pPr>
+        <w:pStyle w:val="ListBullet"/>
+      </w:pPr>
+      <w:r>
+        <w:t>Cached job pool: willUseCachedPoolForOnboarding may show 'Matching roles from today's job pool…' instead of live scrape.</w:t>
       </w:r>
     </w:p>
     <w:p>
@@ -4267,7 +4609,7 @@
       <w:r>
         <w:drawing>
           <wp:inline xmlns:a="http://schemas.openxmlformats.org/drawingml/2006/main" xmlns:pic="http://schemas.openxmlformats.org/drawingml/2006/picture">
-            <wp:extent cx="5943600" cy="5118232"/>
+            <wp:extent cx="5943600" cy="5922127"/>
             <wp:docPr id="15" name="Picture 15"/>
             <wp:cNvGraphicFramePr>
               <a:graphicFrameLocks noChangeAspect="1"/>
@@ -4288,7 +4630,7 @@
                   <pic:spPr>
                     <a:xfrm>
                       <a:off x="0" y="0"/>
-                      <a:ext cx="5943600" cy="5118232"/>
+                      <a:ext cx="5943600" cy="5922127"/>
                     </a:xfrm>
                     <a:prstGeom prst="rect"/>
                   </pic:spPr>
@@ -5156,6 +5498,50 @@
           </w:p>
         </w:tc>
       </w:tr>
+      <w:tr>
+        <w:tc>
+          <w:tcPr>
+            <w:tcW w:type="dxa" w:w="4320"/>
+          </w:tcPr>
+          <w:p>
+            <w:r>
+              <w:t>422</w:t>
+            </w:r>
+          </w:p>
+        </w:tc>
+        <w:tc>
+          <w:tcPr>
+            <w:tcW w:type="dxa" w:w="4320"/>
+          </w:tcPr>
+          <w:p>
+            <w:r>
+              <w:t>AI parse failed or timed out (when ONBOARDING_CV_REGEX_ENABLED=false, no fallback)</w:t>
+            </w:r>
+          </w:p>
+        </w:tc>
+      </w:tr>
+      <w:tr>
+        <w:tc>
+          <w:tcPr>
+            <w:tcW w:type="dxa" w:w="4320"/>
+          </w:tcPr>
+          <w:p>
+            <w:r>
+              <w:t>422</w:t>
+            </w:r>
+          </w:p>
+        </w:tc>
+        <w:tc>
+          <w:tcPr>
+            <w:tcW w:type="dxa" w:w="4320"/>
+          </w:tcPr>
+          <w:p>
+            <w:r>
+              <w:t>CV parse is AI-only; sign-up session required for AI parse</w:t>
+            </w:r>
+          </w:p>
+        </w:tc>
+      </w:tr>
     </w:tbl>
     <w:p/>
     <w:p>
@@ -5827,7 +6213,7 @@
           </w:tcPr>
           <w:p>
             <w:r>
-              <w:t>CV parse metadata between steps</w:t>
+              <w:t>cvMarkdown string + parse metadata between steps (not a disk file)</w:t>
             </w:r>
           </w:p>
         </w:tc>
@@ -6537,6 +6923,94 @@
           </w:tcPr>
           <w:p>
             <w:r>
+              <w:t>CV AI validation</w:t>
+            </w:r>
+          </w:p>
+        </w:tc>
+        <w:tc>
+          <w:tcPr>
+            <w:tcW w:type="dxa" w:w="4320"/>
+          </w:tcPr>
+          <w:p>
+            <w:r>
+              <w:t>backend/src/main/java/com/careerops/service/OnboardingCvParseResultValidator.java</w:t>
+            </w:r>
+          </w:p>
+        </w:tc>
+      </w:tr>
+      <w:tr>
+        <w:tc>
+          <w:tcPr>
+            <w:tcW w:type="dxa" w:w="4320"/>
+          </w:tcPr>
+          <w:p>
+            <w:r>
+              <w:t>NVIDIA request opts</w:t>
+            </w:r>
+          </w:p>
+        </w:tc>
+        <w:tc>
+          <w:tcPr>
+            <w:tcW w:type="dxa" w:w="4320"/>
+          </w:tcPr>
+          <w:p>
+            <w:r>
+              <w:t>backend/src/main/java/com/careerops/service/NvidiaRequestSupport.java</w:t>
+            </w:r>
+          </w:p>
+        </w:tc>
+      </w:tr>
+      <w:tr>
+        <w:tc>
+          <w:tcPr>
+            <w:tcW w:type="dxa" w:w="4320"/>
+          </w:tcPr>
+          <w:p>
+            <w:r>
+              <w:t>Role catalog hint</w:t>
+            </w:r>
+          </w:p>
+        </w:tc>
+        <w:tc>
+          <w:tcPr>
+            <w:tcW w:type="dxa" w:w="4320"/>
+          </w:tcPr>
+          <w:p>
+            <w:r>
+              <w:t>backend/src/main/java/com/careerops/service/OnboardingRoleCatalog.java</w:t>
+            </w:r>
+          </w:p>
+        </w:tc>
+      </w:tr>
+      <w:tr>
+        <w:tc>
+          <w:tcPr>
+            <w:tcW w:type="dxa" w:w="4320"/>
+          </w:tcPr>
+          <w:p>
+            <w:r>
+              <w:t>CV normalization</w:t>
+            </w:r>
+          </w:p>
+        </w:tc>
+        <w:tc>
+          <w:tcPr>
+            <w:tcW w:type="dxa" w:w="4320"/>
+          </w:tcPr>
+          <w:p>
+            <w:r>
+              <w:t>backend/src/main/java/com/careerops/service/CvNormalizationService.java</w:t>
+            </w:r>
+          </w:p>
+        </w:tc>
+      </w:tr>
+      <w:tr>
+        <w:tc>
+          <w:tcPr>
+            <w:tcW w:type="dxa" w:w="4320"/>
+          </w:tcPr>
+          <w:p>
+            <w:r>
               <w:t>Job delivery</w:t>
             </w:r>
           </w:p>
@@ -6548,6 +7022,28 @@
           <w:p>
             <w:r>
               <w:t>backend/src/main/java/com/careerops/service/OnboardingDeliveryService.java</w:t>
+            </w:r>
+          </w:p>
+        </w:tc>
+      </w:tr>
+      <w:tr>
+        <w:tc>
+          <w:tcPr>
+            <w:tcW w:type="dxa" w:w="4320"/>
+          </w:tcPr>
+          <w:p>
+            <w:r>
+              <w:t>Org provisioning</w:t>
+            </w:r>
+          </w:p>
+        </w:tc>
+        <w:tc>
+          <w:tcPr>
+            <w:tcW w:type="dxa" w:w="4320"/>
+          </w:tcPr>
+          <w:p>
+            <w:r>
+              <w:t>backend/src/main/java/com/careerops/service/OrgProvisioningService.java</w:t>
             </w:r>
           </w:p>
         </w:tc>
@@ -6697,7 +7193,7 @@
           </w:tcPr>
           <w:p>
             <w:r>
-              <w:t>onboarding.cv.ai-parse.enabled</w:t>
+              <w:t>ONBOARDING_CV_AI_PARSE_ENABLED</w:t>
             </w:r>
           </w:p>
         </w:tc>
@@ -6717,7 +7213,7 @@
           </w:tcPr>
           <w:p>
             <w:r>
-              <w:t>Enable NVIDIA AI CV parse</w:t>
+              <w:t>onboarding.cv.ai-parse.enabled (default true)</w:t>
             </w:r>
           </w:p>
         </w:tc>
@@ -6729,7 +7225,7 @@
           </w:tcPr>
           <w:p>
             <w:r>
-              <w:t>NVIDIA API keys</w:t>
+              <w:t>ONBOARDING_CV_AI_PARSE_TIMEOUT_MS</w:t>
             </w:r>
           </w:p>
         </w:tc>
@@ -6749,7 +7245,71 @@
           </w:tcPr>
           <w:p>
             <w:r>
-              <w:t>OnboardingCvAiParseService</w:t>
+              <w:t>AI wait before fallback/422 (default 60000)</w:t>
+            </w:r>
+          </w:p>
+        </w:tc>
+      </w:tr>
+      <w:tr>
+        <w:tc>
+          <w:tcPr>
+            <w:tcW w:type="dxa" w:w="2880"/>
+          </w:tcPr>
+          <w:p>
+            <w:r>
+              <w:t>ONBOARDING_CV_REGEX_ENABLED</w:t>
+            </w:r>
+          </w:p>
+        </w:tc>
+        <w:tc>
+          <w:tcPr>
+            <w:tcW w:type="dxa" w:w="2880"/>
+          </w:tcPr>
+          <w:p>
+            <w:r>
+              <w:t>Java</w:t>
+            </w:r>
+          </w:p>
+        </w:tc>
+        <w:tc>
+          <w:tcPr>
+            <w:tcW w:type="dxa" w:w="2880"/>
+          </w:tcPr>
+          <w:p>
+            <w:r>
+              <w:t>onboarding.cv.regex.enabled; false = AI-only, no regex fallback</w:t>
+            </w:r>
+          </w:p>
+        </w:tc>
+      </w:tr>
+      <w:tr>
+        <w:tc>
+          <w:tcPr>
+            <w:tcW w:type="dxa" w:w="2880"/>
+          </w:tcPr>
+          <w:p>
+            <w:r>
+              <w:t>NVIDIA_API_KEY / NVIDIA_MODEL_FAST</w:t>
+            </w:r>
+          </w:p>
+        </w:tc>
+        <w:tc>
+          <w:tcPr>
+            <w:tcW w:type="dxa" w:w="2880"/>
+          </w:tcPr>
+          <w:p>
+            <w:r>
+              <w:t>Java</w:t>
+            </w:r>
+          </w:p>
+        </w:tc>
+        <w:tc>
+          <w:tcPr>
+            <w:tcW w:type="dxa" w:w="2880"/>
+          </w:tcPr>
+          <w:p>
+            <w:r>
+              <w:t>Fast tier for onboarding-cv-parse (nemotron-3-nano)</w:t>
             </w:r>
           </w:p>
         </w:tc>

</xml_diff>